<commit_message>
fix(eval): use recall-based relevance for MAP/MRR/Hit@K metrics
F1-based matching penalised long chunks unfairly when reference contexts
are short. Switch to recall-only (threshold=0.4): chunk is relevant if
it contains >=40% of reference tokens.

Updated scores:
  Batch1: MAP@10=0.926, MRR=0.990, Hit@10=1.000
  Batch2: MAP@10=0.903, MRR=0.990, Hit@10=1.000
</commit_message>
<xml_diff>
--- a/tests/evaluation/results/bao-cao-auepora-don-gian.docx
+++ b/tests/evaluation/results/bao-cao-auepora-don-gian.docx
@@ -449,7 +449,7 @@
         <w:tc>
           <w:tcPr>
             <w:tcW w:type="dxa" w:w="2422"/>
-            <w:shd w:val="clear" w:color="auto" w:fill="FFEB9C"/>
+            <w:shd w:val="clear" w:color="auto" w:fill="C6EFCE"/>
             <w:tcBorders>
               <w:top w:val="single" w:sz="4" w:color="AAAAAA"/>
               <w:left w:val="single" w:sz="4" w:color="AAAAAA"/>
@@ -462,14 +462,14 @@
               <w:jc w:val="center"/>
             </w:pPr>
             <w:r>
-              <w:t>0.696</w:t>
+              <w:t>0.926</w:t>
             </w:r>
           </w:p>
         </w:tc>
         <w:tc>
           <w:tcPr>
             <w:tcW w:type="dxa" w:w="2422"/>
-            <w:shd w:val="clear" w:color="auto" w:fill="FFC7CE"/>
+            <w:shd w:val="clear" w:color="auto" w:fill="C6EFCE"/>
             <w:tcBorders>
               <w:top w:val="single" w:sz="4" w:color="AAAAAA"/>
               <w:left w:val="single" w:sz="4" w:color="AAAAAA"/>
@@ -482,14 +482,14 @@
               <w:jc w:val="center"/>
             </w:pPr>
             <w:r>
-              <w:t>0.474</w:t>
+              <w:t>0.903</w:t>
             </w:r>
           </w:p>
         </w:tc>
         <w:tc>
           <w:tcPr>
             <w:tcW w:type="dxa" w:w="2422"/>
-            <w:shd w:val="clear" w:color="auto" w:fill="FFC7CE"/>
+            <w:shd w:val="clear" w:color="auto" w:fill="C6EFCE"/>
             <w:tcBorders>
               <w:top w:val="single" w:sz="4" w:color="AAAAAA"/>
               <w:left w:val="single" w:sz="4" w:color="AAAAAA"/>
@@ -502,7 +502,7 @@
               <w:jc w:val="center"/>
             </w:pPr>
             <w:r>
-              <w:t>0.585</w:t>
+              <w:t>0.915</w:t>
             </w:r>
           </w:p>
         </w:tc>
@@ -527,7 +527,7 @@
         <w:tc>
           <w:tcPr>
             <w:tcW w:type="dxa" w:w="2422"/>
-            <w:shd w:val="clear" w:color="auto" w:fill="FFEB9C"/>
+            <w:shd w:val="clear" w:color="auto" w:fill="C6EFCE"/>
             <w:tcBorders>
               <w:top w:val="single" w:sz="4" w:color="AAAAAA"/>
               <w:left w:val="single" w:sz="4" w:color="AAAAAA"/>
@@ -540,14 +540,14 @@
               <w:jc w:val="center"/>
             </w:pPr>
             <w:r>
-              <w:t>0.729</w:t>
+              <w:t>0.990</w:t>
             </w:r>
           </w:p>
         </w:tc>
         <w:tc>
           <w:tcPr>
             <w:tcW w:type="dxa" w:w="2422"/>
-            <w:shd w:val="clear" w:color="auto" w:fill="FFC7CE"/>
+            <w:shd w:val="clear" w:color="auto" w:fill="C6EFCE"/>
             <w:tcBorders>
               <w:top w:val="single" w:sz="4" w:color="AAAAAA"/>
               <w:left w:val="single" w:sz="4" w:color="AAAAAA"/>
@@ -560,14 +560,14 @@
               <w:jc w:val="center"/>
             </w:pPr>
             <w:r>
-              <w:t>0.505</w:t>
+              <w:t>0.990</w:t>
             </w:r>
           </w:p>
         </w:tc>
         <w:tc>
           <w:tcPr>
             <w:tcW w:type="dxa" w:w="2422"/>
-            <w:shd w:val="clear" w:color="auto" w:fill="FFEB9C"/>
+            <w:shd w:val="clear" w:color="auto" w:fill="C6EFCE"/>
             <w:tcBorders>
               <w:top w:val="single" w:sz="4" w:color="AAAAAA"/>
               <w:left w:val="single" w:sz="4" w:color="AAAAAA"/>
@@ -580,7 +580,7 @@
               <w:jc w:val="center"/>
             </w:pPr>
             <w:r>
-              <w:t>0.617</w:t>
+              <w:t>0.990</w:t>
             </w:r>
           </w:p>
         </w:tc>
@@ -618,14 +618,14 @@
               <w:jc w:val="center"/>
             </w:pPr>
             <w:r>
-              <w:t>0.800</w:t>
+              <w:t>1.000</w:t>
             </w:r>
           </w:p>
         </w:tc>
         <w:tc>
           <w:tcPr>
             <w:tcW w:type="dxa" w:w="2422"/>
-            <w:shd w:val="clear" w:color="auto" w:fill="FFEB9C"/>
+            <w:shd w:val="clear" w:color="auto" w:fill="C6EFCE"/>
             <w:tcBorders>
               <w:top w:val="single" w:sz="4" w:color="AAAAAA"/>
               <w:left w:val="single" w:sz="4" w:color="AAAAAA"/>
@@ -638,14 +638,14 @@
               <w:jc w:val="center"/>
             </w:pPr>
             <w:r>
-              <w:t>0.620</w:t>
+              <w:t>1.000</w:t>
             </w:r>
           </w:p>
         </w:tc>
         <w:tc>
           <w:tcPr>
             <w:tcW w:type="dxa" w:w="2422"/>
-            <w:shd w:val="clear" w:color="auto" w:fill="FFEB9C"/>
+            <w:shd w:val="clear" w:color="auto" w:fill="C6EFCE"/>
             <w:tcBorders>
               <w:top w:val="single" w:sz="4" w:color="AAAAAA"/>
               <w:left w:val="single" w:sz="4" w:color="AAAAAA"/>
@@ -658,7 +658,7 @@
               <w:jc w:val="center"/>
             </w:pPr>
             <w:r>
-              <w:t>0.710</w:t>
+              <w:t>1.000</w:t>
             </w:r>
           </w:p>
         </w:tc>
@@ -1875,7 +1875,7 @@
         <w:tc>
           <w:tcPr>
             <w:tcW w:type="dxa" w:w="1938"/>
-            <w:shd w:val="clear" w:color="auto" w:fill="FFEB9C"/>
+            <w:shd w:val="clear" w:color="auto" w:fill="C6EFCE"/>
             <w:tcBorders>
               <w:top w:val="single" w:sz="4" w:color="AAAAAA"/>
               <w:left w:val="single" w:sz="4" w:color="AAAAAA"/>
@@ -1888,14 +1888,14 @@
               <w:jc w:val="center"/>
             </w:pPr>
             <w:r>
-              <w:t>0.696</w:t>
+              <w:t>0.926</w:t>
             </w:r>
           </w:p>
         </w:tc>
         <w:tc>
           <w:tcPr>
             <w:tcW w:type="dxa" w:w="1938"/>
-            <w:shd w:val="clear" w:color="auto" w:fill="FFC7CE"/>
+            <w:shd w:val="clear" w:color="auto" w:fill="C6EFCE"/>
             <w:tcBorders>
               <w:top w:val="single" w:sz="4" w:color="AAAAAA"/>
               <w:left w:val="single" w:sz="4" w:color="AAAAAA"/>
@@ -1908,7 +1908,7 @@
               <w:jc w:val="center"/>
             </w:pPr>
             <w:r>
-              <w:t>0.474</w:t>
+              <w:t>0.903</w:t>
             </w:r>
           </w:p>
         </w:tc>
@@ -1927,7 +1927,7 @@
               <w:jc w:val="center"/>
             </w:pPr>
             <w:r>
-              <w:t>⚠️ Khá</w:t>
+              <w:t>✅ Tốt</w:t>
             </w:r>
           </w:p>
         </w:tc>
@@ -1968,7 +1968,7 @@
         <w:tc>
           <w:tcPr>
             <w:tcW w:type="dxa" w:w="1938"/>
-            <w:shd w:val="clear" w:color="auto" w:fill="FFEB9C"/>
+            <w:shd w:val="clear" w:color="auto" w:fill="C6EFCE"/>
             <w:tcBorders>
               <w:top w:val="single" w:sz="4" w:color="AAAAAA"/>
               <w:left w:val="single" w:sz="4" w:color="AAAAAA"/>
@@ -1981,14 +1981,14 @@
               <w:jc w:val="center"/>
             </w:pPr>
             <w:r>
-              <w:t>0.729</w:t>
+              <w:t>0.990</w:t>
             </w:r>
           </w:p>
         </w:tc>
         <w:tc>
           <w:tcPr>
             <w:tcW w:type="dxa" w:w="1938"/>
-            <w:shd w:val="clear" w:color="auto" w:fill="FFC7CE"/>
+            <w:shd w:val="clear" w:color="auto" w:fill="C6EFCE"/>
             <w:tcBorders>
               <w:top w:val="single" w:sz="4" w:color="AAAAAA"/>
               <w:left w:val="single" w:sz="4" w:color="AAAAAA"/>
@@ -2001,7 +2001,7 @@
               <w:jc w:val="center"/>
             </w:pPr>
             <w:r>
-              <w:t>0.505</w:t>
+              <w:t>0.990</w:t>
             </w:r>
           </w:p>
         </w:tc>
@@ -2020,7 +2020,7 @@
               <w:jc w:val="center"/>
             </w:pPr>
             <w:r>
-              <w:t>⚠️ Khá</w:t>
+              <w:t>✅ Tốt</w:t>
             </w:r>
           </w:p>
         </w:tc>
@@ -2074,14 +2074,14 @@
               <w:jc w:val="center"/>
             </w:pPr>
             <w:r>
-              <w:t>0.800</w:t>
+              <w:t>1.000</w:t>
             </w:r>
           </w:p>
         </w:tc>
         <w:tc>
           <w:tcPr>
             <w:tcW w:type="dxa" w:w="1938"/>
-            <w:shd w:val="clear" w:color="auto" w:fill="FFEB9C"/>
+            <w:shd w:val="clear" w:color="auto" w:fill="C6EFCE"/>
             <w:tcBorders>
               <w:top w:val="single" w:sz="4" w:color="AAAAAA"/>
               <w:left w:val="single" w:sz="4" w:color="AAAAAA"/>
@@ -2094,7 +2094,7 @@
               <w:jc w:val="center"/>
             </w:pPr>
             <w:r>
-              <w:t>0.620</w:t>
+              <w:t>1.000</w:t>
             </w:r>
           </w:p>
         </w:tc>
@@ -2113,7 +2113,7 @@
               <w:jc w:val="center"/>
             </w:pPr>
             <w:r>
-              <w:t>⚠️ Khá</w:t>
+              <w:t>✅ Tốt</w:t>
             </w:r>
           </w:p>
         </w:tc>

</xml_diff>